<commit_message>
Engine imports READ FRANCE's reading engine instead of the acquiz copy; the historical cold-answer gate and form rules now run on every draft
- @read-france/reading-engine (VREAD-corp/vread-reading-engine, git dependency pinned to 4fa251d): PDF/DOCX
  extraction, segmenter, answer presence, quote location, duplicates, cold-answer gate (vread-workflow-def a5df9a9)
- engine/qa.ts + cli steps cold / judge (offline: prompts to a file, answers and verdicts back from files); check fails
  closed on a leak or a missing/stale cold answer
- public sample: items answerable without the document rewritten, re-gated and re-tested; sample re-rendered; QA in qa/
- tests for the cold gate

Co-Authored-By: Claude Opus 5.5 (1M context) <noreply@anthropic.com>
</commit_message>
<xml_diff>
--- a/samples/gestion-temps/output/acquimetre-evaluations-8-11-exemple-gestion-temps/C01-gestion-professionnelle-du-temps/C01-2-fin-de-formation-stagiaire.docx
+++ b/samples/gestion-temps/output/acquimetre-evaluations-8-11-exemple-gestion-temps/C01-gestion-professionnelle-du-temps/C01-2-fin-de-formation-stagiaire.docx
@@ -43,7 +43,7 @@
         <w:t xml:space="preserve">Version :</w:t>
       </w:r>
       <w:r>
-        <w:t xml:space="preserve"> commande exemple-gestion-temps, 13/10/2026</w:t>
+        <w:t xml:space="preserve"> commande exemple-gestion-temps, 16/10/2026</w:t>
       </w:r>
     </w:p>
     <w:p>
@@ -277,36 +277,36 @@
         <w:t xml:space="preserve">3.</w:t>
       </w:r>
       <w:r>
-        <w:t xml:space="preserve"> Le temps de travail diminue et l’entreprise veut produire autant. Quel moyen le cours ne cite-t-il PAS pour compenser la perte de production ?</w:t>
-      </w:r>
-    </w:p>
-    <w:p>
-      <w:pPr>
-        <w:spacing w:after="120"/>
-      </w:pPr>
-      <w:r>
-        <w:t xml:space="preserve">☐ a) Une baisse des prix de vente</w:t>
-      </w:r>
-      <w:r>
-        <w:br/>
-        <w:t xml:space="preserve"/>
-      </w:r>
-      <w:r>
-        <w:t xml:space="preserve">☐ b) Des heures complémentaires</w:t>
-      </w:r>
-      <w:r>
-        <w:br/>
-        <w:t xml:space="preserve"/>
-      </w:r>
-      <w:r>
-        <w:t xml:space="preserve">☐ c) Des embauches</w:t>
-      </w:r>
-      <w:r>
-        <w:br/>
-        <w:t xml:space="preserve"/>
-      </w:r>
-      <w:r>
-        <w:t xml:space="preserve">☐ d) Des progrès de productivité</w:t>
+        <w:t xml:space="preserve"> Le cours compte les noms de marques contenant le mot « chrono ». Combien en étaient déposés en 1954 ?</w:t>
+      </w:r>
+    </w:p>
+    <w:p>
+      <w:pPr>
+        <w:spacing w:after="120"/>
+      </w:pPr>
+      <w:r>
+        <w:t xml:space="preserve">☐ a) 1 800</w:t>
+      </w:r>
+      <w:r>
+        <w:br/>
+        <w:t xml:space="preserve"/>
+      </w:r>
+      <w:r>
+        <w:t xml:space="preserve">☐ b) 18</w:t>
+      </w:r>
+      <w:r>
+        <w:br/>
+        <w:t xml:space="preserve"/>
+      </w:r>
+      <w:r>
+        <w:t xml:space="preserve">☐ c) 2</w:t>
+      </w:r>
+      <w:r>
+        <w:br/>
+        <w:t xml:space="preserve"/>
+      </w:r>
+      <w:r>
+        <w:t xml:space="preserve">☐ d) 240</w:t>
       </w:r>
     </w:p>
     <w:p>
@@ -321,36 +321,36 @@
         <w:t xml:space="preserve">4.</w:t>
       </w:r>
       <w:r>
-        <w:t xml:space="preserve"> Vous estimez une tâche à 2 heures et appliquez la réserve de 40 % de l’exemple NERAC du cours. Quelle durée planifiez-vous ?</w:t>
-      </w:r>
-    </w:p>
-    <w:p>
-      <w:pPr>
-        <w:spacing w:after="120"/>
-      </w:pPr>
-      <w:r>
-        <w:t xml:space="preserve">☐ a) 2 h 48</w:t>
-      </w:r>
-      <w:r>
-        <w:br/>
-        <w:t xml:space="preserve"/>
-      </w:r>
-      <w:r>
-        <w:t xml:space="preserve">☐ b) 2 h 08</w:t>
-      </w:r>
-      <w:r>
-        <w:br/>
-        <w:t xml:space="preserve"/>
-      </w:r>
-      <w:r>
-        <w:t xml:space="preserve">☐ c) 2 h 24</w:t>
-      </w:r>
-      <w:r>
-        <w:br/>
-        <w:t xml:space="preserve"/>
-      </w:r>
-      <w:r>
-        <w:t xml:space="preserve">☐ d) 2 h 40</w:t>
+        <w:t xml:space="preserve"> Quelle tâche le cours prend-il comme exemple pour dérouler la méthode NERAC étape par étape ?</w:t>
+      </w:r>
+    </w:p>
+    <w:p>
+      <w:pPr>
+        <w:spacing w:after="120"/>
+      </w:pPr>
+      <w:r>
+        <w:t xml:space="preserve">☐ a) L’organisation d’une réunion d’équipe</w:t>
+      </w:r>
+      <w:r>
+        <w:br/>
+        <w:t xml:space="preserve"/>
+      </w:r>
+      <w:r>
+        <w:t xml:space="preserve">☐ b) La mise à jour d’un tableau de bord</w:t>
+      </w:r>
+      <w:r>
+        <w:br/>
+        <w:t xml:space="preserve"/>
+      </w:r>
+      <w:r>
+        <w:t xml:space="preserve">☐ c) La préparation d’un rapport mensuel</w:t>
+      </w:r>
+      <w:r>
+        <w:br/>
+        <w:t xml:space="preserve"/>
+      </w:r>
+      <w:r>
+        <w:t xml:space="preserve">☐ d) Le traitement des e-mails du matin</w:t>
       </w:r>
     </w:p>
     <w:p>
@@ -365,7 +365,7 @@
         <w:t xml:space="preserve">5.</w:t>
       </w:r>
       <w:r>
-        <w:t xml:space="preserve"> Dans la méthode NERAC, à quelle étape définit-on pour chaque tâche son degré d’importance ou d’urgence ? (un verbe)</w:t>
+        <w:t xml:space="preserve"> Selon le cours, à l’étape « Réserver » de NERAC, qu’émet-on sur le temps estimé de chaque tâche ? (un mot)</w:t>
       </w:r>
     </w:p>
     <w:p>
@@ -388,36 +388,36 @@
         <w:t xml:space="preserve">6.</w:t>
       </w:r>
       <w:r>
-        <w:t xml:space="preserve"> Lors de l’étape de contrôle du déroulement du travail, que compare-t-on ?</w:t>
-      </w:r>
-    </w:p>
-    <w:p>
-      <w:pPr>
-        <w:spacing w:after="120"/>
-      </w:pPr>
-      <w:r>
-        <w:t xml:space="preserve">☐ a) Les devis de plusieurs fournisseurs</w:t>
-      </w:r>
-      <w:r>
-        <w:br/>
-        <w:t xml:space="preserve"/>
-      </w:r>
-      <w:r>
-        <w:t xml:space="preserve">☐ b) Les salaires et le chiffre d’affaires</w:t>
-      </w:r>
-      <w:r>
-        <w:br/>
-        <w:t xml:space="preserve"/>
-      </w:r>
-      <w:r>
-        <w:t xml:space="preserve">☐ c) Le travail réalisé et ce qui avait été prévu</w:t>
-      </w:r>
-      <w:r>
-        <w:br/>
-        <w:t xml:space="preserve"/>
-      </w:r>
-      <w:r>
-        <w:t xml:space="preserve">☐ d) Les horaires de deux services</w:t>
+        <w:t xml:space="preserve"> Dans les étapes d’organisation du chapitre 2, que détermine-t-on lors de la fixation des objectifs et des enjeux ?</w:t>
+      </w:r>
+    </w:p>
+    <w:p>
+      <w:pPr>
+        <w:spacing w:after="120"/>
+      </w:pPr>
+      <w:r>
+        <w:t xml:space="preserve">☐ a) La liste des responsables de chaque tâche</w:t>
+      </w:r>
+      <w:r>
+        <w:br/>
+        <w:t xml:space="preserve"/>
+      </w:r>
+      <w:r>
+        <w:t xml:space="preserve">☐ b) Les indicateurs de satisfaction des clients</w:t>
+      </w:r>
+      <w:r>
+        <w:br/>
+        <w:t xml:space="preserve"/>
+      </w:r>
+      <w:r>
+        <w:t xml:space="preserve">☐ c) La durée d’une tâche ou d’un projet et son délai de réalisation</w:t>
+      </w:r>
+      <w:r>
+        <w:br/>
+        <w:t xml:space="preserve"/>
+      </w:r>
+      <w:r>
+        <w:t xml:space="preserve">☐ d) Le budget et les ressources humaines du projet</w:t>
       </w:r>
     </w:p>
     <w:p>
@@ -432,36 +432,36 @@
         <w:t xml:space="preserve">7.</w:t>
       </w:r>
       <w:r>
-        <w:t xml:space="preserve"> Dans l’exemple de l’atelier de fabrication, les références F, A et I représentent 3 types de réparations sur 10. Quelle part de la totalité des réparations représentent-elles ?</w:t>
-      </w:r>
-    </w:p>
-    <w:p>
-      <w:pPr>
-        <w:spacing w:after="120"/>
-      </w:pPr>
-      <w:r>
-        <w:t xml:space="preserve">☐ a) 50 %</w:t>
-      </w:r>
-      <w:r>
-        <w:br/>
-        <w:t xml:space="preserve"/>
-      </w:r>
-      <w:r>
-        <w:t xml:space="preserve">☐ b) 80 %</w:t>
-      </w:r>
-      <w:r>
-        <w:br/>
-        <w:t xml:space="preserve"/>
-      </w:r>
-      <w:r>
-        <w:t xml:space="preserve">☐ c) 70 %</w:t>
-      </w:r>
-      <w:r>
-        <w:br/>
-        <w:t xml:space="preserve"/>
-      </w:r>
-      <w:r>
-        <w:t xml:space="preserve">☐ d) 30 %</w:t>
+        <w:t xml:space="preserve"> Dans l’exemple de l’atelier de fabrication, quel type de réparation arrive en tête du classement par quantité ?</w:t>
+      </w:r>
+    </w:p>
+    <w:p>
+      <w:pPr>
+        <w:spacing w:after="120"/>
+      </w:pPr>
+      <w:r>
+        <w:t xml:space="preserve">☐ a) Montage poignet</w:t>
+      </w:r>
+      <w:r>
+        <w:br/>
+        <w:t xml:space="preserve"/>
+      </w:r>
+      <w:r>
+        <w:t xml:space="preserve">☐ b) Couture de la boutonnière</w:t>
+      </w:r>
+      <w:r>
+        <w:br/>
+        <w:t xml:space="preserve"/>
+      </w:r>
+      <w:r>
+        <w:t xml:space="preserve">☐ c) Placage poche</w:t>
+      </w:r>
+      <w:r>
+        <w:br/>
+        <w:t xml:space="preserve"/>
+      </w:r>
+      <w:r>
+        <w:t xml:space="preserve">☐ d) Montage col</w:t>
       </w:r>
     </w:p>
     <w:p>
@@ -543,36 +543,36 @@
         <w:t xml:space="preserve">10.</w:t>
       </w:r>
       <w:r>
-        <w:t xml:space="preserve"> Une assistante dispose de 330 minutes par jour pour enregistrer des contrats et en enregistre 55. Quel est le temps moyen d’exécution d’un contrat ?</w:t>
-      </w:r>
-    </w:p>
-    <w:p>
-      <w:pPr>
-        <w:spacing w:after="120"/>
-      </w:pPr>
-      <w:r>
-        <w:t xml:space="preserve">☐ a) 6 minutes</w:t>
-      </w:r>
-      <w:r>
-        <w:br/>
-        <w:t xml:space="preserve"/>
-      </w:r>
-      <w:r>
-        <w:t xml:space="preserve">☐ b) 8 minutes</w:t>
-      </w:r>
-      <w:r>
-        <w:br/>
-        <w:t xml:space="preserve"/>
-      </w:r>
-      <w:r>
-        <w:t xml:space="preserve">☐ c) 5 minutes</w:t>
-      </w:r>
-      <w:r>
-        <w:br/>
-        <w:t xml:space="preserve"/>
-      </w:r>
-      <w:r>
-        <w:t xml:space="preserve">☐ d) 7 minutes</w:t>
+        <w:t xml:space="preserve"> Dans l’exemple de pendulage, quel objectif global le responsable fixe-t-il à l’assistante qui enregistre les contrats ?</w:t>
+      </w:r>
+    </w:p>
+    <w:p>
+      <w:pPr>
+        <w:spacing w:after="120"/>
+      </w:pPr>
+      <w:r>
+        <w:t xml:space="preserve">☐ a) 60 contrats par jour</w:t>
+      </w:r>
+      <w:r>
+        <w:br/>
+        <w:t xml:space="preserve"/>
+      </w:r>
+      <w:r>
+        <w:t xml:space="preserve">☐ b) 72 contrats par jour</w:t>
+      </w:r>
+      <w:r>
+        <w:br/>
+        <w:t xml:space="preserve"/>
+      </w:r>
+      <w:r>
+        <w:t xml:space="preserve">☐ c) 55 contrats par jour</w:t>
+      </w:r>
+      <w:r>
+        <w:br/>
+        <w:t xml:space="preserve"/>
+      </w:r>
+      <w:r>
+        <w:t xml:space="preserve">☐ d) 66 contrats par jour</w:t>
       </w:r>
     </w:p>
     <w:p>
@@ -587,36 +587,36 @@
         <w:t xml:space="preserve">11.</w:t>
       </w:r>
       <w:r>
-        <w:t xml:space="preserve"> Pour quel type d’activité le pendulage n’est-il PAS adapté ?</w:t>
-      </w:r>
-    </w:p>
-    <w:p>
-      <w:pPr>
-        <w:spacing w:after="120"/>
-      </w:pPr>
-      <w:r>
-        <w:t xml:space="preserve">☐ a) La mise sous enveloppe des lettres</w:t>
-      </w:r>
-      <w:r>
-        <w:br/>
-        <w:t xml:space="preserve"/>
-      </w:r>
-      <w:r>
-        <w:t xml:space="preserve">☐ b) La saisie de variables</w:t>
-      </w:r>
-      <w:r>
-        <w:br/>
-        <w:t xml:space="preserve"/>
-      </w:r>
-      <w:r>
-        <w:t xml:space="preserve">☐ c) La saisie des commandes</w:t>
-      </w:r>
-      <w:r>
-        <w:br/>
-        <w:t xml:space="preserve"/>
-      </w:r>
-      <w:r>
-        <w:t xml:space="preserve">☐ d) Les activités intellectuelles</w:t>
+        <w:t xml:space="preserve"> Pour tenir son objectif, le service de contrats de maintenance du cours mise sur la productivité. À quelle durée ramènerait-il la saisie d’un contrat ?</w:t>
+      </w:r>
+    </w:p>
+    <w:p>
+      <w:pPr>
+        <w:spacing w:after="120"/>
+      </w:pPr>
+      <w:r>
+        <w:t xml:space="preserve">☐ a) 5 minutes</w:t>
+      </w:r>
+      <w:r>
+        <w:br/>
+        <w:t xml:space="preserve"/>
+      </w:r>
+      <w:r>
+        <w:t xml:space="preserve">☐ b) 6 minutes</w:t>
+      </w:r>
+      <w:r>
+        <w:br/>
+        <w:t xml:space="preserve"/>
+      </w:r>
+      <w:r>
+        <w:t xml:space="preserve">☐ c) 4 minutes</w:t>
+      </w:r>
+      <w:r>
+        <w:br/>
+        <w:t xml:space="preserve"/>
+      </w:r>
+      <w:r>
+        <w:t xml:space="preserve">☐ d) 3 minutes</w:t>
       </w:r>
     </w:p>
     <w:p>
@@ -631,36 +631,36 @@
         <w:t xml:space="preserve">12.</w:t>
       </w:r>
       <w:r>
-        <w:t xml:space="preserve"> Dans l’exemple de la grille d’auto-analyse du temps, que conseille le cours pour traiter les e-mails ?</w:t>
-      </w:r>
-    </w:p>
-    <w:p>
-      <w:pPr>
-        <w:spacing w:after="120"/>
-      </w:pPr>
-      <w:r>
-        <w:t xml:space="preserve">☐ a) Confier la lecture des e-mails à un collègue</w:t>
-      </w:r>
-      <w:r>
-        <w:br/>
-        <w:t xml:space="preserve"/>
-      </w:r>
-      <w:r>
-        <w:t xml:space="preserve">☐ b) Répondre à chaque e-mail dès son arrivée</w:t>
-      </w:r>
-      <w:r>
-        <w:br/>
-        <w:t xml:space="preserve"/>
-      </w:r>
-      <w:r>
-        <w:t xml:space="preserve">☐ c) Désactiver la messagerie pendant la semaine</w:t>
-      </w:r>
-      <w:r>
-        <w:br/>
-        <w:t xml:space="preserve"/>
-      </w:r>
-      <w:r>
-        <w:t xml:space="preserve">☐ d) Réserver des plages horaires à la lecture et à la rédaction des réponses</w:t>
+        <w:t xml:space="preserve"> Dans l’exemple de la grille d’auto-analyse, quand la personne réserve-t-elle sa plage horaire « E-Mail » ?</w:t>
+      </w:r>
+    </w:p>
+    <w:p>
+      <w:pPr>
+        <w:spacing w:after="120"/>
+      </w:pPr>
+      <w:r>
+        <w:t xml:space="preserve">☐ a) Le vendredi après-midi, pour solder la semaine</w:t>
+      </w:r>
+      <w:r>
+        <w:br/>
+        <w:t xml:space="preserve"/>
+      </w:r>
+      <w:r>
+        <w:t xml:space="preserve">☐ b) Deux fois par jour, à 11 h et à 16 h</w:t>
+      </w:r>
+      <w:r>
+        <w:br/>
+        <w:t xml:space="preserve"/>
+      </w:r>
+      <w:r>
+        <w:t xml:space="preserve">☐ c) Toutes les 90 minutes, entre deux paquets de travail</w:t>
+      </w:r>
+      <w:r>
+        <w:br/>
+        <w:t xml:space="preserve"/>
+      </w:r>
+      <w:r>
+        <w:t xml:space="preserve">☐ d) Tous les lundis matin, ou 1 heure chaque jour le matin en arrivant ou après le déjeuner</w:t>
       </w:r>
     </w:p>
     <w:p>
@@ -675,36 +675,36 @@
         <w:t xml:space="preserve">13.</w:t>
       </w:r>
       <w:r>
-        <w:t xml:space="preserve"> Quel outil met en évidence le chemin critique des tâches d’un projet afin d’en limiter la durée ?</w:t>
-      </w:r>
-    </w:p>
-    <w:p>
-      <w:pPr>
-        <w:spacing w:after="120"/>
-      </w:pPr>
-      <w:r>
-        <w:t xml:space="preserve">☐ a) Le calendrier partagé</w:t>
-      </w:r>
-      <w:r>
-        <w:br/>
-        <w:t xml:space="preserve"/>
-      </w:r>
-      <w:r>
-        <w:t xml:space="preserve">☐ b) Le diagramme de PERT</w:t>
-      </w:r>
-      <w:r>
-        <w:br/>
-        <w:t xml:space="preserve"/>
-      </w:r>
-      <w:r>
-        <w:t xml:space="preserve">☐ c) La carte heuristique</w:t>
-      </w:r>
-      <w:r>
-        <w:br/>
-        <w:t xml:space="preserve"/>
-      </w:r>
-      <w:r>
-        <w:t xml:space="preserve">☐ d) La pointeuse</w:t>
+        <w:t xml:space="preserve"> Le cours cite un agenda partagé spécialisé dans le secteur de la santé. Quel est son nom ?</w:t>
+      </w:r>
+    </w:p>
+    <w:p>
+      <w:pPr>
+        <w:spacing w:after="120"/>
+      </w:pPr>
+      <w:r>
+        <w:t xml:space="preserve">☐ a) Doodle</w:t>
+      </w:r>
+      <w:r>
+        <w:br/>
+        <w:t xml:space="preserve"/>
+      </w:r>
+      <w:r>
+        <w:t xml:space="preserve">☐ b) Rendez Vous Facile</w:t>
+      </w:r>
+      <w:r>
+        <w:br/>
+        <w:t xml:space="preserve"/>
+      </w:r>
+      <w:r>
+        <w:t xml:space="preserve">☐ c) Share Calendar</w:t>
+      </w:r>
+      <w:r>
+        <w:br/>
+        <w:t xml:space="preserve"/>
+      </w:r>
+      <w:r>
+        <w:t xml:space="preserve">☐ d) Teamsoft</w:t>
       </w:r>
     </w:p>
     <w:p>
@@ -719,36 +719,36 @@
         <w:t xml:space="preserve">14.</w:t>
       </w:r>
       <w:r>
-        <w:t xml:space="preserve"> À quelle condition le calendrier partagé est-il un outil très efficace ?</w:t>
-      </w:r>
-    </w:p>
-    <w:p>
-      <w:pPr>
-        <w:spacing w:after="120"/>
-      </w:pPr>
-      <w:r>
-        <w:t xml:space="preserve">☐ a) S’il est réservé au dirigeant</w:t>
-      </w:r>
-      <w:r>
-        <w:br/>
-        <w:t xml:space="preserve"/>
-      </w:r>
-      <w:r>
-        <w:t xml:space="preserve">☐ b) S’il est imprimé chaque semaine</w:t>
-      </w:r>
-      <w:r>
-        <w:br/>
-        <w:t xml:space="preserve"/>
-      </w:r>
-      <w:r>
-        <w:t xml:space="preserve">☐ c) S’il est correctement renseigné par tous</w:t>
-      </w:r>
-      <w:r>
-        <w:br/>
-        <w:t xml:space="preserve"/>
-      </w:r>
-      <w:r>
-        <w:t xml:space="preserve">☐ d) S’il remplace les réunions</w:t>
+        <w:t xml:space="preserve"> Le cours cite quatre logiciels de carte heuristique : Free Mind, Freeplane, Mymap et un quatrième. Quel est-il ?</w:t>
+      </w:r>
+    </w:p>
+    <w:p>
+      <w:pPr>
+        <w:spacing w:after="120"/>
+      </w:pPr>
+      <w:r>
+        <w:t xml:space="preserve">☐ a) XMind</w:t>
+      </w:r>
+      <w:r>
+        <w:br/>
+        <w:t xml:space="preserve"/>
+      </w:r>
+      <w:r>
+        <w:t xml:space="preserve">☐ b) MindManager</w:t>
+      </w:r>
+      <w:r>
+        <w:br/>
+        <w:t xml:space="preserve"/>
+      </w:r>
+      <w:r>
+        <w:t xml:space="preserve">☐ c) The Brain</w:t>
+      </w:r>
+      <w:r>
+        <w:br/>
+        <w:t xml:space="preserve"/>
+      </w:r>
+      <w:r>
+        <w:t xml:space="preserve">☐ d) Coggle</w:t>
       </w:r>
     </w:p>
     <w:p>
@@ -763,7 +763,7 @@
         <w:t xml:space="preserve">15.</w:t>
       </w:r>
       <w:r>
-        <w:t xml:space="preserve"> Quand il est difficile de répondre aux questions du QQOQCCP, le cours propose de faire le cheminement… (un mot)</w:t>
+        <w:t xml:space="preserve"> Quand il est difficile de répondre aux questions du QQOQCCP, quel sigle suivi de « ne pas » le cours propose-t-il ? (un mot)</w:t>
       </w:r>
     </w:p>
     <w:p>

</xml_diff>